<commit_message>
Initialisation du repos et mise a disposition des collaborateurs. Modification
</commit_message>
<xml_diff>
--- a/documentation/Architecture_Base_de_Donnees_Medicale.docx
+++ b/documentation/Architecture_Base_de_Donnees_Medicale.docx
@@ -1691,6 +1691,236 @@
         <w:t>) ENGINE=InnoDB;</w:t>
       </w:r>
     </w:p>
+    <w:p>
+      <w:pPr>
+        <w:pStyle w:val="Normal"/>
+        <w:shd w:val="clear" w:fill="1A202C"/>
+        <w:spacing w:before="160" w:after="160"/>
+        <w:ind w:start="288"/>
+        <w:rPr>
+          <w:rFonts w:ascii="Consolas" w:hAnsi="Consolas"/>
+          <w:sz w:val="18"/>
+          <w:shd w:fill="auto" w:val="clear"/>
+        </w:rPr>
+      </w:pPr>
+      <w:r>
+        <w:rPr>
+          <w:rFonts w:ascii="Consolas" w:hAnsi="Consolas"/>
+          <w:sz w:val="18"/>
+          <w:shd w:fill="auto" w:val="clear"/>
+        </w:rPr>
+        <w:t>CREATE TABLE IF NOT EXISTS password_reset_tokens (</w:t>
+      </w:r>
+    </w:p>
+    <w:p>
+      <w:pPr>
+        <w:pStyle w:val="Normal"/>
+        <w:shd w:val="clear" w:fill="1A202C"/>
+        <w:spacing w:before="160" w:after="160"/>
+        <w:ind w:start="288"/>
+        <w:rPr>
+          <w:rFonts w:ascii="Consolas" w:hAnsi="Consolas"/>
+          <w:sz w:val="18"/>
+          <w:shd w:fill="auto" w:val="clear"/>
+        </w:rPr>
+      </w:pPr>
+      <w:r>
+        <w:rPr>
+          <w:rFonts w:ascii="Consolas" w:hAnsi="Consolas"/>
+          <w:sz w:val="18"/>
+          <w:shd w:fill="auto" w:val="clear"/>
+        </w:rPr>
+        <w:t>id BIGINT AUTO_INCREMENT PRIMARY KEY,</w:t>
+      </w:r>
+    </w:p>
+    <w:p>
+      <w:pPr>
+        <w:pStyle w:val="Normal"/>
+        <w:shd w:val="clear" w:fill="1A202C"/>
+        <w:spacing w:before="160" w:after="160"/>
+        <w:ind w:start="288"/>
+        <w:rPr>
+          <w:rFonts w:ascii="Consolas" w:hAnsi="Consolas"/>
+          <w:sz w:val="18"/>
+          <w:shd w:fill="auto" w:val="clear"/>
+        </w:rPr>
+      </w:pPr>
+      <w:r>
+        <w:rPr>
+          <w:rFonts w:ascii="Consolas" w:hAnsi="Consolas"/>
+          <w:sz w:val="18"/>
+          <w:shd w:fill="auto" w:val="clear"/>
+        </w:rPr>
+        <w:t>token VARCHAR(255) NOT NULL UNIQUE,</w:t>
+      </w:r>
+    </w:p>
+    <w:p>
+      <w:pPr>
+        <w:pStyle w:val="Normal"/>
+        <w:shd w:val="clear" w:fill="1A202C"/>
+        <w:spacing w:before="160" w:after="160"/>
+        <w:ind w:start="288"/>
+        <w:rPr>
+          <w:rFonts w:ascii="Consolas" w:hAnsi="Consolas"/>
+          <w:sz w:val="18"/>
+          <w:shd w:fill="auto" w:val="clear"/>
+        </w:rPr>
+      </w:pPr>
+      <w:r>
+        <w:rPr>
+          <w:rFonts w:ascii="Consolas" w:hAnsi="Consolas"/>
+          <w:sz w:val="18"/>
+          <w:shd w:fill="auto" w:val="clear"/>
+        </w:rPr>
+        <w:t>expiry_date DATETIME NOT NULL,</w:t>
+      </w:r>
+    </w:p>
+    <w:p>
+      <w:pPr>
+        <w:pStyle w:val="Normal"/>
+        <w:shd w:val="clear" w:fill="1A202C"/>
+        <w:spacing w:before="160" w:after="160"/>
+        <w:ind w:start="288"/>
+        <w:rPr>
+          <w:rFonts w:ascii="Consolas" w:hAnsi="Consolas"/>
+          <w:sz w:val="18"/>
+          <w:shd w:fill="auto" w:val="clear"/>
+        </w:rPr>
+      </w:pPr>
+      <w:r>
+        <w:rPr>
+          <w:rFonts w:ascii="Consolas" w:hAnsi="Consolas"/>
+          <w:sz w:val="18"/>
+          <w:shd w:fill="auto" w:val="clear"/>
+        </w:rPr>
+        <w:t>user_id BIGINT NOT NULL,</w:t>
+      </w:r>
+    </w:p>
+    <w:p>
+      <w:pPr>
+        <w:pStyle w:val="Normal"/>
+        <w:shd w:val="clear" w:fill="1A202C"/>
+        <w:spacing w:before="160" w:after="160"/>
+        <w:ind w:start="288"/>
+        <w:rPr>
+          <w:rFonts w:ascii="Consolas" w:hAnsi="Consolas"/>
+          <w:sz w:val="18"/>
+          <w:shd w:fill="auto" w:val="clear"/>
+        </w:rPr>
+      </w:pPr>
+      <w:r>
+        <w:rPr>
+          <w:rFonts w:ascii="Consolas" w:hAnsi="Consolas"/>
+          <w:sz w:val="18"/>
+          <w:shd w:fill="auto" w:val="clear"/>
+        </w:rPr>
+        <w:t>CONSTRAINT fk_token_user FOREIGN KEY (user_id) REFERENCES utilisateurs(id_utilisateur) ON DELETE CASCADE,</w:t>
+      </w:r>
+    </w:p>
+    <w:p>
+      <w:pPr>
+        <w:pStyle w:val="Normal"/>
+        <w:shd w:val="clear" w:fill="1A202C"/>
+        <w:spacing w:before="160" w:after="160"/>
+        <w:ind w:start="288"/>
+        <w:rPr>
+          <w:rFonts w:ascii="Consolas" w:hAnsi="Consolas"/>
+          <w:sz w:val="18"/>
+          <w:shd w:fill="auto" w:val="clear"/>
+        </w:rPr>
+      </w:pPr>
+      <w:r>
+        <w:rPr>
+          <w:rFonts w:ascii="Consolas" w:hAnsi="Consolas"/>
+          <w:sz w:val="18"/>
+          <w:shd w:fill="auto" w:val="clear"/>
+        </w:rPr>
+        <w:t>INDEX idx_token (token)</w:t>
+      </w:r>
+    </w:p>
+    <w:p>
+      <w:pPr>
+        <w:pStyle w:val="Normal"/>
+        <w:shd w:val="clear" w:fill="1A202C"/>
+        <w:spacing w:before="160" w:after="160"/>
+        <w:ind w:start="288"/>
+        <w:rPr>
+          <w:rFonts w:ascii="Consolas" w:hAnsi="Consolas"/>
+          <w:sz w:val="18"/>
+          <w:shd w:fill="auto" w:val="clear"/>
+        </w:rPr>
+      </w:pPr>
+      <w:r>
+        <w:rPr>
+          <w:rFonts w:ascii="Consolas" w:hAnsi="Consolas"/>
+          <w:sz w:val="18"/>
+          <w:shd w:fill="auto" w:val="clear"/>
+        </w:rPr>
+        <w:t>) ENGINE=InnoDB;</w:t>
+      </w:r>
+    </w:p>
+    <w:p>
+      <w:pPr>
+        <w:pStyle w:val="Normal"/>
+        <w:shd w:val="clear" w:fill="1A202C"/>
+        <w:spacing w:before="160" w:after="160"/>
+        <w:ind w:start="288"/>
+        <w:rPr>
+          <w:rFonts w:ascii="Consolas" w:hAnsi="Consolas"/>
+          <w:sz w:val="18"/>
+          <w:shd w:fill="auto" w:val="clear"/>
+        </w:rPr>
+      </w:pPr>
+      <w:r>
+        <w:rPr>
+          <w:rFonts w:ascii="Consolas" w:hAnsi="Consolas"/>
+          <w:sz w:val="18"/>
+          <w:shd w:fill="auto" w:val="clear"/>
+        </w:rPr>
+      </w:r>
+    </w:p>
+    <w:p>
+      <w:pPr>
+        <w:pStyle w:val="Normal"/>
+        <w:shd w:val="clear" w:fill="1A202C"/>
+        <w:spacing w:before="160" w:after="160"/>
+        <w:ind w:start="288"/>
+        <w:rPr>
+          <w:rFonts w:ascii="Consolas" w:hAnsi="Consolas"/>
+          <w:sz w:val="18"/>
+          <w:shd w:fill="auto" w:val="clear"/>
+        </w:rPr>
+      </w:pPr>
+      <w:r>
+        <w:rPr>
+          <w:rFonts w:ascii="Consolas" w:hAnsi="Consolas"/>
+          <w:sz w:val="18"/>
+          <w:shd w:fill="auto" w:val="clear"/>
+        </w:rPr>
+        <w:t>-- Mise à jour de la table utilisateurs pour l'image de profil</w:t>
+      </w:r>
+    </w:p>
+    <w:p>
+      <w:pPr>
+        <w:pStyle w:val="Normal"/>
+        <w:shd w:val="clear" w:fill="1A202C"/>
+        <w:spacing w:before="160" w:after="160"/>
+        <w:ind w:start="288"/>
+        <w:rPr>
+          <w:rFonts w:ascii="Consolas" w:hAnsi="Consolas"/>
+          <w:sz w:val="18"/>
+          <w:shd w:fill="auto" w:val="clear"/>
+        </w:rPr>
+      </w:pPr>
+      <w:r>
+        <w:rPr>
+          <w:rFonts w:ascii="Consolas" w:hAnsi="Consolas"/>
+          <w:sz w:val="18"/>
+          <w:shd w:fill="auto" w:val="clear"/>
+        </w:rPr>
+        <w:t>ALTER TABLE utilisateurs ADD COLUMN IF NOT EXISTS profile_image_url VARCHAR(255) DEFAULT NULL;</w:t>
+      </w:r>
+    </w:p>
     <w:sectPr>
       <w:type w:val="nextPage"/>
       <w:pgSz w:w="12240" w:h="15840"/>
@@ -3449,8 +3679,8 @@
       <w:spacing w:val="5"/>
     </w:rPr>
   </w:style>
-  <w:style w:type="character" w:styleId="Bulletsuser">
-    <w:name w:val="Bullets (user)"/>
+  <w:style w:type="character" w:styleId="Bullets">
+    <w:name w:val="Bullets"/>
     <w:qFormat/>
     <w:rPr>
       <w:rFonts w:ascii="OpenSymbol" w:hAnsi="OpenSymbol" w:eastAsia="OpenSymbol" w:cs="OpenSymbol"/>

</xml_diff>